<commit_message>
Pdf and git link
</commit_message>
<xml_diff>
--- a/doc/Лр 1 Кожуховский.docx
+++ b/doc/Лр 1 Кожуховский.docx
@@ -1628,10 +1628,10 @@
           <w:szCs w:val="28"/>
         </w:rPr>
         <w:drawing>
-          <wp:inline distT="0" distB="0" distL="0" distR="0" wp14:anchorId="30451674" wp14:editId="34D52820">
-            <wp:extent cx="4797188" cy="3495204"/>
-            <wp:effectExtent l="0" t="0" r="3810" b="0"/>
-            <wp:docPr id="2" name="Рисунок 2"/>
+          <wp:inline distT="0" distB="0" distL="0" distR="0" wp14:anchorId="0250C2AD" wp14:editId="748814F4">
+            <wp:extent cx="4838700" cy="3465967"/>
+            <wp:effectExtent l="0" t="0" r="0" b="1270"/>
+            <wp:docPr id="3" name="Рисунок 3"/>
             <wp:cNvGraphicFramePr>
               <a:graphicFrameLocks xmlns:a="http://schemas.openxmlformats.org/drawingml/2006/main" noChangeAspect="1"/>
             </wp:cNvGraphicFramePr>
@@ -1651,7 +1651,7 @@
                   <pic:spPr>
                     <a:xfrm>
                       <a:off x="0" y="0"/>
-                      <a:ext cx="4808743" cy="3503623"/>
+                      <a:ext cx="4852695" cy="3475991"/>
                     </a:xfrm>
                     <a:prstGeom prst="rect">
                       <a:avLst/>
@@ -1775,7 +1775,9 @@
         <w:ind w:firstLine="709"/>
         <w:jc w:val="both"/>
         <w:rPr>
-          <w:sz w:val="28"/>
+          <w:color w:val="000000" w:themeColor="text1"/>
+          <w:sz w:val="28"/>
+          <w:szCs w:val="28"/>
         </w:rPr>
       </w:pPr>
       <w:r>
@@ -1815,6 +1817,33 @@
       <w:pPr>
         <w:spacing w:line="360" w:lineRule="auto"/>
         <w:ind w:firstLine="709"/>
+        <w:jc w:val="both"/>
+        <w:rPr>
+          <w:sz w:val="28"/>
+          <w:lang w:val="en-150"/>
+        </w:rPr>
+      </w:pPr>
+      <w:r>
+        <w:rPr>
+          <w:color w:val="000000" w:themeColor="text1"/>
+          <w:sz w:val="28"/>
+          <w:szCs w:val="28"/>
+        </w:rPr>
+        <w:t xml:space="preserve">Ссылка: </w:t>
+      </w:r>
+      <w:r>
+        <w:rPr>
+          <w:color w:val="000000" w:themeColor="text1"/>
+          <w:sz w:val="28"/>
+          <w:szCs w:val="28"/>
+        </w:rPr>
+        <w:t>https://github.com/Viktorkozh/AI_1</w:t>
+      </w:r>
+    </w:p>
+    <w:p>
+      <w:pPr>
+        <w:spacing w:line="360" w:lineRule="auto"/>
+        <w:ind w:firstLine="709"/>
         <w:jc w:val="center"/>
         <w:rPr>
           <w:sz w:val="28"/>
@@ -1952,23 +1981,29 @@
         <w:rPr>
           <w:sz w:val="28"/>
         </w:rPr>
-        <w:t>Задача заключается в нахождении кратчайшего пути для робота, перемещающегося по лабиринту, представленному в виде двумерной сетки. Лабиринт состоит из свободных для перемещения клеток и препятствий, которые необходимо обходить. Начальная и конечная точки задаются как координаты на сетке, и требуется определить оптимальный маршрут между ними.</w:t>
-      </w:r>
-    </w:p>
-    <w:p>
-      <w:pPr>
-        <w:spacing w:line="360" w:lineRule="auto"/>
-        <w:ind w:firstLine="709"/>
-        <w:jc w:val="both"/>
-        <w:rPr>
-          <w:sz w:val="28"/>
-        </w:rPr>
-      </w:pPr>
+        <w:t xml:space="preserve">Задача заключается в нахождении кратчайшего пути для робота, перемещающегося по лабиринту, представленному в виде двумерной сетки. Лабиринт состоит из свободных для перемещения клеток и препятствий, которые необходимо обходить. Начальная и конечная точки задаются как </w:t>
+      </w:r>
       <w:r>
         <w:rPr>
           <w:sz w:val="28"/>
         </w:rPr>
         <w:lastRenderedPageBreak/>
+        <w:t>координаты на сетке, и требуется определить оптимальный маршрут между ними.</w:t>
+      </w:r>
+    </w:p>
+    <w:p>
+      <w:pPr>
+        <w:spacing w:line="360" w:lineRule="auto"/>
+        <w:ind w:firstLine="709"/>
+        <w:jc w:val="both"/>
+        <w:rPr>
+          <w:sz w:val="28"/>
+        </w:rPr>
+      </w:pPr>
+      <w:r>
+        <w:rPr>
+          <w:sz w:val="28"/>
+        </w:rPr>
         <w:t>Эвристический поиск, такой как алгоритм A*, может быть использован для решения этой задачи. Он использует комбинацию эвристической оценки и фактического расстояния для нахождения оптимального пути. Эвристика в данном случае может быть оценкой оставшегося расстояния до цели.</w:t>
       </w:r>
     </w:p>
@@ -2045,7 +2080,21 @@
         <w:rPr>
           <w:sz w:val="28"/>
         </w:rPr>
-        <w:t>Даже если технически возможно построить структуру данных для представления всех возможных ходов в шахматах, встает вопрос о ресурсах - времени и памяти. Для многих задач эти ограничения могут быть преодолены, но в контексте шахмат они становятся критическими факторами. Необходимость быстро обрабатывать информацию и принимать решения в условиях, когда время может быть ограниченно делает задачу создания эффективного шахматного ИИ особенно сложной.</w:t>
+        <w:t xml:space="preserve">Даже если технически возможно построить структуру данных для представления всех возможных ходов в шахматах, встает вопрос о ресурсах - времени и памяти. Для многих задач эти ограничения могут быть преодолены, но в контексте шахмат они становятся критическими факторами. Необходимость быстро обрабатывать информацию и принимать решения в условиях, когда </w:t>
+      </w:r>
+      <w:proofErr w:type="gramStart"/>
+      <w:r>
+        <w:rPr>
+          <w:sz w:val="28"/>
+        </w:rPr>
+        <w:t>время может быть</w:t>
+      </w:r>
+      <w:proofErr w:type="gramEnd"/>
+      <w:r>
+        <w:rPr>
+          <w:sz w:val="28"/>
+        </w:rPr>
+        <w:t xml:space="preserve"> ограниченно делает задачу создания эффективного шахматного ИИ особенно сложной.</w:t>
       </w:r>
     </w:p>
     <w:p>
@@ -2089,23 +2138,29 @@
         <w:rPr>
           <w:sz w:val="28"/>
         </w:rPr>
-        <w:t>Многие задачи в искусственном интеллекте, будь то шахматы, планирование маршрута или доказательство математических теорем, сводятся к поиску эффективного пути в огромном пространстве возможных решений. ИИ должен найти способ эффективно исследовать это пространство, балансируя между доступными ресурсами и желаемым качеством решения, что делает его уникальным и незаменимым инструментом в современном мире.</w:t>
-      </w:r>
-    </w:p>
-    <w:p>
-      <w:pPr>
-        <w:spacing w:line="360" w:lineRule="auto"/>
-        <w:ind w:firstLine="709"/>
-        <w:jc w:val="both"/>
-        <w:rPr>
-          <w:sz w:val="28"/>
-        </w:rPr>
-      </w:pPr>
+        <w:t xml:space="preserve">Многие задачи в искусственном интеллекте, будь то шахматы, планирование маршрута или доказательство математических теорем, сводятся к поиску эффективного пути в огромном пространстве возможных решений. ИИ должен найти способ эффективно исследовать это пространство, балансируя между доступными ресурсами и желаемым качеством решения, </w:t>
+      </w:r>
       <w:r>
         <w:rPr>
           <w:sz w:val="28"/>
         </w:rPr>
         <w:lastRenderedPageBreak/>
+        <w:t>что делает его уникальным и незаменимым инструментом в современном мире.</w:t>
+      </w:r>
+    </w:p>
+    <w:p>
+      <w:pPr>
+        <w:spacing w:line="360" w:lineRule="auto"/>
+        <w:ind w:firstLine="709"/>
+        <w:jc w:val="both"/>
+        <w:rPr>
+          <w:sz w:val="28"/>
+        </w:rPr>
+      </w:pPr>
+      <w:r>
+        <w:rPr>
+          <w:sz w:val="28"/>
+        </w:rPr>
         <w:t>8. Как алгоритмы ИИ балансируют между скоростью вычислений и нахождением</w:t>
       </w:r>
       <w:r>
@@ -2394,6 +2449,7 @@
         <w:rPr>
           <w:sz w:val="28"/>
         </w:rPr>
+        <w:lastRenderedPageBreak/>
         <w:t>Достижение целевого узла это и есть целевое состояние.</w:t>
       </w:r>
     </w:p>
@@ -2426,163 +2482,205 @@
         <w:rPr>
           <w:sz w:val="28"/>
         </w:rPr>
+        <w:t>По алгоритму поиска по дереву первым шагом будет выбор листового узла для дальнейшего расширения.</w:t>
+      </w:r>
+    </w:p>
+    <w:p>
+      <w:pPr>
+        <w:spacing w:line="360" w:lineRule="auto"/>
+        <w:ind w:firstLine="709"/>
+        <w:jc w:val="both"/>
+        <w:rPr>
+          <w:sz w:val="28"/>
+        </w:rPr>
+      </w:pPr>
+      <w:r>
+        <w:rPr>
+          <w:sz w:val="28"/>
+        </w:rPr>
+        <w:t>Сначала мы проверяем, достигли ли мы цели. В данном случае — нет, поскольку исходное состояние не совпадает с целевым. Следовательно, мы расширяем исходный узел. Расширение подразумевает применение функции преемника, которая определяет все возможные действия, применимые к текущему состоянию. Эта функция генерирует дочерние узлы, представляющие все города, в которые можно попасть, совершив одно действие из текущего.</w:t>
+      </w:r>
+    </w:p>
+    <w:p>
+      <w:pPr>
+        <w:spacing w:line="360" w:lineRule="auto"/>
+        <w:ind w:firstLine="709"/>
+        <w:jc w:val="both"/>
+        <w:rPr>
+          <w:sz w:val="28"/>
+        </w:rPr>
+      </w:pPr>
+      <w:r>
+        <w:rPr>
+          <w:sz w:val="28"/>
+        </w:rPr>
+        <w:t>17. Чем различаются состояния и узлы в дереве поиска?</w:t>
+      </w:r>
+    </w:p>
+    <w:p>
+      <w:pPr>
+        <w:spacing w:line="360" w:lineRule="auto"/>
+        <w:ind w:firstLine="709"/>
+        <w:jc w:val="both"/>
+        <w:rPr>
+          <w:sz w:val="28"/>
+        </w:rPr>
+      </w:pPr>
+      <w:r>
+        <w:rPr>
+          <w:sz w:val="28"/>
+        </w:rPr>
+        <w:t xml:space="preserve">Состояние (State) </w:t>
+      </w:r>
+      <w:proofErr w:type="gramStart"/>
+      <w:r>
+        <w:rPr>
+          <w:sz w:val="28"/>
+        </w:rPr>
+        <w:t>- это</w:t>
+      </w:r>
+      <w:proofErr w:type="gramEnd"/>
+      <w:r>
+        <w:rPr>
+          <w:sz w:val="28"/>
+        </w:rPr>
+        <w:t xml:space="preserve"> представление конфигурации в нашем пространстве поиска, например, города на карте Румынии, где мы находимся, или конфигурация плиток в головоломке.</w:t>
+      </w:r>
+    </w:p>
+    <w:p>
+      <w:pPr>
+        <w:spacing w:line="360" w:lineRule="auto"/>
+        <w:ind w:firstLine="709"/>
+        <w:jc w:val="both"/>
+        <w:rPr>
+          <w:sz w:val="28"/>
+        </w:rPr>
+      </w:pPr>
+      <w:r>
+        <w:rPr>
+          <w:sz w:val="28"/>
+        </w:rPr>
+        <w:t xml:space="preserve">Узел (Node) </w:t>
+      </w:r>
+      <w:proofErr w:type="gramStart"/>
+      <w:r>
+        <w:rPr>
+          <w:sz w:val="28"/>
+        </w:rPr>
+        <w:t>- это</w:t>
+      </w:r>
+      <w:proofErr w:type="gramEnd"/>
+      <w:r>
+        <w:rPr>
+          <w:sz w:val="28"/>
+        </w:rPr>
+        <w:t xml:space="preserve"> структура данных о состоянии, содержащая само состояние, а также другие данные: указатель на родительский узел, действие, стоимость пути и глубину узла в дереве.</w:t>
+      </w:r>
+    </w:p>
+    <w:p>
+      <w:pPr>
+        <w:spacing w:line="360" w:lineRule="auto"/>
+        <w:ind w:firstLine="709"/>
+        <w:jc w:val="both"/>
+        <w:rPr>
+          <w:sz w:val="28"/>
+        </w:rPr>
+      </w:pPr>
+      <w:r>
+        <w:rPr>
+          <w:sz w:val="28"/>
+        </w:rPr>
+        <w:t>18. Что такое функция преемника и как она используется в алгоритме поиска?</w:t>
+      </w:r>
+    </w:p>
+    <w:p>
+      <w:pPr>
+        <w:spacing w:line="360" w:lineRule="auto"/>
+        <w:ind w:firstLine="709"/>
+        <w:jc w:val="both"/>
+        <w:rPr>
+          <w:sz w:val="28"/>
+        </w:rPr>
+      </w:pPr>
+      <w:r>
+        <w:rPr>
+          <w:sz w:val="28"/>
+        </w:rPr>
+        <w:t>Расширение подразумевает применение функции преемника, которая определяет все возможные действия, применимые к текущему состоянию. Эта функция генерирует дочерние узлы, представляющие все города, в которые можно попасть, совершив одно действие из текущего.</w:t>
+      </w:r>
+    </w:p>
+    <w:p>
+      <w:pPr>
+        <w:spacing w:line="360" w:lineRule="auto"/>
+        <w:ind w:firstLine="709"/>
+        <w:jc w:val="both"/>
+        <w:rPr>
+          <w:sz w:val="28"/>
+        </w:rPr>
+      </w:pPr>
+      <w:r>
+        <w:rPr>
+          <w:sz w:val="28"/>
+        </w:rPr>
+        <w:t>19. Какое влияние на поиск оказывают такие параметры, как b (разветвление), d</w:t>
+      </w:r>
+      <w:r>
+        <w:rPr>
+          <w:sz w:val="28"/>
+        </w:rPr>
+        <w:t xml:space="preserve"> </w:t>
+      </w:r>
+      <w:r>
+        <w:rPr>
+          <w:sz w:val="28"/>
+        </w:rPr>
+        <w:t>(глубина решения) и m (максимальная глубина)?</w:t>
+      </w:r>
+    </w:p>
+    <w:p>
+      <w:pPr>
+        <w:spacing w:line="360" w:lineRule="auto"/>
+        <w:ind w:firstLine="709"/>
+        <w:jc w:val="both"/>
+        <w:rPr>
+          <w:sz w:val="28"/>
+        </w:rPr>
+      </w:pPr>
+      <w:r>
+        <w:rPr>
+          <w:sz w:val="28"/>
+        </w:rPr>
+        <w:t xml:space="preserve">b, d и m используются для описания временной и пространственной сложности в алгебраической форме, позволяя точно </w:t>
+      </w:r>
+      <w:proofErr w:type="gramStart"/>
+      <w:r>
+        <w:rPr>
+          <w:sz w:val="28"/>
+        </w:rPr>
+        <w:t>оценить</w:t>
+      </w:r>
+      <w:proofErr w:type="gramEnd"/>
+      <w:r>
+        <w:rPr>
+          <w:sz w:val="28"/>
+        </w:rPr>
+        <w:t xml:space="preserve"> как изменяется количество сгенерированных узлов в зависимости от параметров задачи.</w:t>
+      </w:r>
+    </w:p>
+    <w:p>
+      <w:pPr>
+        <w:spacing w:line="360" w:lineRule="auto"/>
+        <w:ind w:firstLine="709"/>
+        <w:jc w:val="both"/>
+        <w:rPr>
+          <w:sz w:val="28"/>
+        </w:rPr>
+      </w:pPr>
+      <w:r>
+        <w:rPr>
+          <w:sz w:val="28"/>
+        </w:rPr>
         <w:lastRenderedPageBreak/>
-        <w:t>По алгоритму поиска по дереву первым шагом будет выбор листового узла для дальнейшего расширения.</w:t>
-      </w:r>
-    </w:p>
-    <w:p>
-      <w:pPr>
-        <w:spacing w:line="360" w:lineRule="auto"/>
-        <w:ind w:firstLine="709"/>
-        <w:jc w:val="both"/>
-        <w:rPr>
-          <w:sz w:val="28"/>
-        </w:rPr>
-      </w:pPr>
-      <w:r>
-        <w:rPr>
-          <w:sz w:val="28"/>
-        </w:rPr>
-        <w:t>Сначала мы проверяем, достигли ли мы цели. В данном случае — нет, поскольку исходное состояние не совпадает с целевым. Следовательно, мы расширяем исходный узел. Расширение подразумевает применение функции преемника, которая определяет все возможные действия, применимые к текущему состоянию. Эта функция генерирует дочерние узлы, представляющие все города, в которые можно попасть, совершив одно действие из текущего.</w:t>
-      </w:r>
-    </w:p>
-    <w:p>
-      <w:pPr>
-        <w:spacing w:line="360" w:lineRule="auto"/>
-        <w:ind w:firstLine="709"/>
-        <w:jc w:val="both"/>
-        <w:rPr>
-          <w:sz w:val="28"/>
-        </w:rPr>
-      </w:pPr>
-      <w:r>
-        <w:rPr>
-          <w:sz w:val="28"/>
-        </w:rPr>
-        <w:t>17. Чем различаются состояния и узлы в дереве поиска?</w:t>
-      </w:r>
-    </w:p>
-    <w:p>
-      <w:pPr>
-        <w:spacing w:line="360" w:lineRule="auto"/>
-        <w:ind w:firstLine="709"/>
-        <w:jc w:val="both"/>
-        <w:rPr>
-          <w:sz w:val="28"/>
-        </w:rPr>
-      </w:pPr>
-      <w:r>
-        <w:rPr>
-          <w:sz w:val="28"/>
-        </w:rPr>
-        <w:t>Состояние (State) - это представление конфигурации в нашем пространстве поиска, например, города на карте Румынии, где мы находимся, или конфигурация плиток в головоломке.</w:t>
-      </w:r>
-    </w:p>
-    <w:p>
-      <w:pPr>
-        <w:spacing w:line="360" w:lineRule="auto"/>
-        <w:ind w:firstLine="709"/>
-        <w:jc w:val="both"/>
-        <w:rPr>
-          <w:sz w:val="28"/>
-        </w:rPr>
-      </w:pPr>
-      <w:r>
-        <w:rPr>
-          <w:sz w:val="28"/>
-        </w:rPr>
-        <w:t>Узел (Node) - это структура данных о состоянии, содержащая само состояние, а также другие данные: указатель на родительский узел, действие, стоимость пути и глубину узла в дереве.</w:t>
-      </w:r>
-    </w:p>
-    <w:p>
-      <w:pPr>
-        <w:spacing w:line="360" w:lineRule="auto"/>
-        <w:ind w:firstLine="709"/>
-        <w:jc w:val="both"/>
-        <w:rPr>
-          <w:sz w:val="28"/>
-        </w:rPr>
-      </w:pPr>
-      <w:r>
-        <w:rPr>
-          <w:sz w:val="28"/>
-        </w:rPr>
-        <w:t>18. Что такое функция преемника и как она используется в алгоритме поиска?</w:t>
-      </w:r>
-    </w:p>
-    <w:p>
-      <w:pPr>
-        <w:spacing w:line="360" w:lineRule="auto"/>
-        <w:ind w:firstLine="709"/>
-        <w:jc w:val="both"/>
-        <w:rPr>
-          <w:sz w:val="28"/>
-        </w:rPr>
-      </w:pPr>
-      <w:r>
-        <w:rPr>
-          <w:sz w:val="28"/>
-        </w:rPr>
-        <w:t>Расширение подразумевает применение функции преемника, которая определяет все возможные действия, применимые к текущему состоянию. Эта функция генерирует дочерние узлы, представляющие все города, в которые можно попасть, совершив одно действие из текущего.</w:t>
-      </w:r>
-    </w:p>
-    <w:p>
-      <w:pPr>
-        <w:spacing w:line="360" w:lineRule="auto"/>
-        <w:ind w:firstLine="709"/>
-        <w:jc w:val="both"/>
-        <w:rPr>
-          <w:sz w:val="28"/>
-        </w:rPr>
-      </w:pPr>
-      <w:r>
-        <w:rPr>
-          <w:sz w:val="28"/>
-        </w:rPr>
-        <w:t>19. Какое влияние на поиск оказывают такие параметры, как b (разветвление), d</w:t>
-      </w:r>
-      <w:r>
-        <w:rPr>
-          <w:sz w:val="28"/>
-        </w:rPr>
-        <w:t xml:space="preserve"> </w:t>
-      </w:r>
-      <w:r>
-        <w:rPr>
-          <w:sz w:val="28"/>
-        </w:rPr>
-        <w:t>(глубина решения) и m (максимальная глубина)?</w:t>
-      </w:r>
-    </w:p>
-    <w:p>
-      <w:pPr>
-        <w:spacing w:line="360" w:lineRule="auto"/>
-        <w:ind w:firstLine="709"/>
-        <w:jc w:val="both"/>
-        <w:rPr>
-          <w:sz w:val="28"/>
-        </w:rPr>
-      </w:pPr>
-      <w:r>
-        <w:rPr>
-          <w:sz w:val="28"/>
-        </w:rPr>
-        <w:t>b, d и m используются для описания временной и пространственной сложности в алгебраической форме, позволяя точно оценить как изменяется количество сгенерированных узлов в зависимости от параметров задачи.</w:t>
-      </w:r>
-    </w:p>
-    <w:p>
-      <w:pPr>
-        <w:spacing w:line="360" w:lineRule="auto"/>
-        <w:ind w:firstLine="709"/>
-        <w:jc w:val="both"/>
-        <w:rPr>
-          <w:sz w:val="28"/>
-        </w:rPr>
-      </w:pPr>
-      <w:r>
-        <w:rPr>
-          <w:sz w:val="28"/>
-        </w:rPr>
         <w:t>20. Как алгоритмы поиска по дереву оцениваются по критериям полноты,</w:t>
       </w:r>
       <w:r>
@@ -2627,367 +2725,381 @@
         <w:rPr>
           <w:sz w:val="28"/>
         </w:rPr>
+        <w:t>Отсутствие решения возможно только в случае, когда задача невыполнима.</w:t>
+      </w:r>
+    </w:p>
+    <w:p>
+      <w:pPr>
+        <w:spacing w:line="360" w:lineRule="auto"/>
+        <w:ind w:firstLine="709"/>
+        <w:jc w:val="both"/>
+        <w:rPr>
+          <w:sz w:val="28"/>
+        </w:rPr>
+      </w:pPr>
+      <w:r>
+        <w:rPr>
+          <w:sz w:val="28"/>
+        </w:rPr>
+        <w:t>Временная сложность измеряется количеством сгенерированных узлов, а не</w:t>
+      </w:r>
+      <w:r>
+        <w:rPr>
+          <w:sz w:val="28"/>
+        </w:rPr>
+        <w:t xml:space="preserve"> </w:t>
+      </w:r>
+      <w:r>
+        <w:rPr>
+          <w:sz w:val="28"/>
+        </w:rPr>
+        <w:t>временем в секундах или циклах ЦПУ. Она пропорциональна общему</w:t>
+      </w:r>
+      <w:r>
+        <w:rPr>
+          <w:sz w:val="28"/>
+        </w:rPr>
+        <w:t xml:space="preserve"> </w:t>
+      </w:r>
+      <w:r>
+        <w:rPr>
+          <w:sz w:val="28"/>
+        </w:rPr>
+        <w:t>количеству узлов.</w:t>
+      </w:r>
+    </w:p>
+    <w:p>
+      <w:pPr>
+        <w:spacing w:line="360" w:lineRule="auto"/>
+        <w:ind w:firstLine="709"/>
+        <w:jc w:val="both"/>
+        <w:rPr>
+          <w:sz w:val="28"/>
+        </w:rPr>
+      </w:pPr>
+      <w:r>
+        <w:rPr>
+          <w:sz w:val="28"/>
+        </w:rPr>
+        <w:t>Пространственная сложность относится к максимальному количеству узлов,</w:t>
+      </w:r>
+      <w:r>
+        <w:rPr>
+          <w:sz w:val="28"/>
+        </w:rPr>
+        <w:t xml:space="preserve"> </w:t>
+      </w:r>
+      <w:r>
+        <w:rPr>
+          <w:sz w:val="28"/>
+        </w:rPr>
+        <w:t>которые нужно хранить в памяти в любой момент времени. В некоторых</w:t>
+      </w:r>
+    </w:p>
+    <w:p>
+      <w:pPr>
+        <w:spacing w:line="360" w:lineRule="auto"/>
+        <w:ind w:firstLine="709"/>
+        <w:jc w:val="both"/>
+        <w:rPr>
+          <w:sz w:val="28"/>
+        </w:rPr>
+      </w:pPr>
+      <w:r>
+        <w:rPr>
+          <w:sz w:val="28"/>
+        </w:rPr>
+        <w:t>алгоритмах она совпадает с временной сложностью.</w:t>
+      </w:r>
+    </w:p>
+    <w:p>
+      <w:pPr>
+        <w:spacing w:line="360" w:lineRule="auto"/>
+        <w:ind w:firstLine="709"/>
+        <w:jc w:val="both"/>
+        <w:rPr>
+          <w:sz w:val="28"/>
+        </w:rPr>
+      </w:pPr>
+      <w:r>
+        <w:rPr>
+          <w:sz w:val="28"/>
+        </w:rPr>
+        <w:t>Пространственная сложность зависит от того, какие узлы сохраняются в</w:t>
+      </w:r>
+      <w:r>
+        <w:rPr>
+          <w:sz w:val="28"/>
+        </w:rPr>
+        <w:t xml:space="preserve"> </w:t>
+      </w:r>
+      <w:r>
+        <w:rPr>
+          <w:sz w:val="28"/>
+        </w:rPr>
+        <w:t>памяти. В некоторых алгоритмах необходимо сохранять все сгенерированные</w:t>
+      </w:r>
+      <w:r>
+        <w:rPr>
+          <w:sz w:val="28"/>
+        </w:rPr>
+        <w:t xml:space="preserve"> </w:t>
+      </w:r>
+      <w:r>
+        <w:rPr>
+          <w:sz w:val="28"/>
+        </w:rPr>
+        <w:t>узлы, тогда как в других узлы могут быть отброшены после проверки, не</w:t>
+      </w:r>
+      <w:r>
+        <w:rPr>
+          <w:sz w:val="28"/>
+        </w:rPr>
+        <w:t xml:space="preserve"> </w:t>
+      </w:r>
+      <w:r>
+        <w:rPr>
+          <w:sz w:val="28"/>
+        </w:rPr>
+        <w:t>требуя длительного сохранения в памяти. Это различие позволяет временной</w:t>
+      </w:r>
+      <w:r>
+        <w:rPr>
+          <w:sz w:val="28"/>
+        </w:rPr>
+        <w:t xml:space="preserve"> </w:t>
+      </w:r>
+      <w:r>
+        <w:rPr>
+          <w:sz w:val="28"/>
+        </w:rPr>
+        <w:t>и пространственной сложности отличаться друг от друга.</w:t>
+      </w:r>
+    </w:p>
+    <w:p>
+      <w:pPr>
+        <w:spacing w:line="360" w:lineRule="auto"/>
+        <w:ind w:firstLine="709"/>
+        <w:jc w:val="both"/>
+        <w:rPr>
+          <w:sz w:val="28"/>
+        </w:rPr>
+      </w:pPr>
+      <w:r>
+        <w:rPr>
+          <w:sz w:val="28"/>
+        </w:rPr>
+        <w:t xml:space="preserve">Оптимальность </w:t>
+      </w:r>
+      <w:proofErr w:type="gramStart"/>
+      <w:r>
+        <w:rPr>
+          <w:sz w:val="28"/>
+        </w:rPr>
+        <w:t>- это</w:t>
+      </w:r>
+      <w:proofErr w:type="gramEnd"/>
+      <w:r>
+        <w:rPr>
+          <w:sz w:val="28"/>
+        </w:rPr>
+        <w:t xml:space="preserve"> способность алгоритма всегда находить наилучшее</w:t>
+      </w:r>
+    </w:p>
+    <w:p>
+      <w:pPr>
+        <w:spacing w:line="360" w:lineRule="auto"/>
+        <w:ind w:firstLine="709"/>
+        <w:jc w:val="both"/>
+        <w:rPr>
+          <w:sz w:val="28"/>
+        </w:rPr>
+      </w:pPr>
+      <w:r>
+        <w:rPr>
+          <w:sz w:val="28"/>
+        </w:rPr>
+        <w:t>решение с минимальной стоимостью, если таковое существует. Она не</w:t>
+      </w:r>
+    </w:p>
+    <w:p>
+      <w:pPr>
+        <w:spacing w:line="360" w:lineRule="auto"/>
+        <w:ind w:firstLine="709"/>
+        <w:jc w:val="both"/>
+        <w:rPr>
+          <w:sz w:val="28"/>
+        </w:rPr>
+      </w:pPr>
+      <w:r>
+        <w:rPr>
+          <w:sz w:val="28"/>
+        </w:rPr>
+        <w:t>связана напрямую с временной или пространственной сложностью, которые</w:t>
+      </w:r>
+      <w:r>
+        <w:rPr>
+          <w:sz w:val="28"/>
+        </w:rPr>
+        <w:t xml:space="preserve"> </w:t>
+      </w:r>
+      <w:r>
+        <w:rPr>
+          <w:sz w:val="28"/>
+        </w:rPr>
+        <w:t>измеряют количество узлов. Оптимальность не гарантирует быстродействие</w:t>
+      </w:r>
+      <w:r>
+        <w:rPr>
+          <w:sz w:val="28"/>
+        </w:rPr>
+        <w:t xml:space="preserve"> </w:t>
+      </w:r>
+      <w:r>
+        <w:rPr>
+          <w:sz w:val="28"/>
+        </w:rPr>
+        <w:t>или экономию памяти, а лишь обеспечивает нахождение решения с</w:t>
+      </w:r>
+      <w:r>
+        <w:rPr>
+          <w:sz w:val="28"/>
+        </w:rPr>
+        <w:t xml:space="preserve"> </w:t>
+      </w:r>
+      <w:r>
+        <w:rPr>
+          <w:sz w:val="28"/>
+        </w:rPr>
+        <w:t>наименьшей стоимостью.</w:t>
+      </w:r>
+    </w:p>
+    <w:p>
+      <w:pPr>
+        <w:spacing w:line="360" w:lineRule="auto"/>
+        <w:ind w:firstLine="709"/>
+        <w:jc w:val="both"/>
+        <w:rPr>
+          <w:sz w:val="28"/>
+        </w:rPr>
+      </w:pPr>
+      <w:r>
+        <w:rPr>
+          <w:sz w:val="28"/>
+        </w:rPr>
+        <w:t>1. b (максимальный коэффициент разветвления) - показывает, сколько</w:t>
+      </w:r>
+      <w:r>
+        <w:rPr>
+          <w:sz w:val="28"/>
+        </w:rPr>
+        <w:t xml:space="preserve"> </w:t>
+      </w:r>
+      <w:r>
+        <w:rPr>
+          <w:sz w:val="28"/>
+        </w:rPr>
+        <w:t>дочерних узлов может иметь один узел.</w:t>
+      </w:r>
+    </w:p>
+    <w:p>
+      <w:pPr>
+        <w:spacing w:line="360" w:lineRule="auto"/>
+        <w:ind w:firstLine="709"/>
+        <w:jc w:val="both"/>
+        <w:rPr>
+          <w:sz w:val="28"/>
+        </w:rPr>
+      </w:pPr>
+      <w:r>
+        <w:rPr>
+          <w:sz w:val="28"/>
+        </w:rPr>
+        <w:t>2. d (глубина наименее дорогого решения) - определяет, насколько далеко</w:t>
+      </w:r>
+      <w:r>
+        <w:rPr>
+          <w:sz w:val="28"/>
+        </w:rPr>
+        <w:t xml:space="preserve"> </w:t>
+      </w:r>
+      <w:r>
+        <w:rPr>
+          <w:sz w:val="28"/>
+        </w:rPr>
+        <w:t>нужно спуститься по дереву для нахождения оптимального решения.</w:t>
+      </w:r>
+    </w:p>
+    <w:p>
+      <w:pPr>
+        <w:spacing w:line="360" w:lineRule="auto"/>
+        <w:ind w:firstLine="709"/>
+        <w:jc w:val="both"/>
+        <w:rPr>
+          <w:sz w:val="28"/>
+        </w:rPr>
+      </w:pPr>
+      <w:r>
+        <w:rPr>
+          <w:sz w:val="28"/>
+        </w:rPr>
+        <w:t>3. m (максимальная глубина дерева) - показывает, насколько глубоко можно в</w:t>
+      </w:r>
+      <w:r>
+        <w:rPr>
+          <w:sz w:val="28"/>
+        </w:rPr>
+        <w:t xml:space="preserve"> </w:t>
+      </w:r>
+      <w:r>
+        <w:rPr>
+          <w:sz w:val="28"/>
+        </w:rPr>
+        <w:t>принципе спуститься по дереву. В некоторых случаях это значение может быть</w:t>
+      </w:r>
+      <w:r>
+        <w:rPr>
+          <w:sz w:val="28"/>
+        </w:rPr>
+        <w:t xml:space="preserve"> </w:t>
+      </w:r>
+      <w:r>
+        <w:rPr>
+          <w:sz w:val="28"/>
+        </w:rPr>
+        <w:t>бесконечным.</w:t>
+      </w:r>
+    </w:p>
+    <w:p>
+      <w:pPr>
+        <w:spacing w:line="360" w:lineRule="auto"/>
+        <w:ind w:firstLine="709"/>
+        <w:jc w:val="both"/>
+        <w:rPr>
+          <w:sz w:val="28"/>
+        </w:rPr>
+      </w:pPr>
+      <w:r>
+        <w:rPr>
+          <w:sz w:val="28"/>
+        </w:rPr>
+        <w:t>21. Какую роль выполняет класс Problem в приведенном коде?</w:t>
+      </w:r>
+    </w:p>
+    <w:p>
+      <w:pPr>
+        <w:spacing w:line="360" w:lineRule="auto"/>
+        <w:ind w:firstLine="709"/>
+        <w:jc w:val="both"/>
+        <w:rPr>
+          <w:sz w:val="28"/>
+        </w:rPr>
+      </w:pPr>
+      <w:r>
+        <w:rPr>
+          <w:sz w:val="28"/>
+        </w:rPr>
         <w:lastRenderedPageBreak/>
-        <w:t>Отсутствие решения возможно только в случае, когда задача невыполнима.</w:t>
-      </w:r>
-    </w:p>
-    <w:p>
-      <w:pPr>
-        <w:spacing w:line="360" w:lineRule="auto"/>
-        <w:ind w:firstLine="709"/>
-        <w:jc w:val="both"/>
-        <w:rPr>
-          <w:sz w:val="28"/>
-        </w:rPr>
-      </w:pPr>
-      <w:r>
-        <w:rPr>
-          <w:sz w:val="28"/>
-        </w:rPr>
-        <w:t>Временная сложность измеряется количеством сгенерированных узлов, а не</w:t>
-      </w:r>
-      <w:r>
-        <w:rPr>
-          <w:sz w:val="28"/>
-        </w:rPr>
-        <w:t xml:space="preserve"> </w:t>
-      </w:r>
-      <w:r>
-        <w:rPr>
-          <w:sz w:val="28"/>
-        </w:rPr>
-        <w:t>временем в секундах или циклах ЦПУ. Она пропорциональна общему</w:t>
-      </w:r>
-      <w:r>
-        <w:rPr>
-          <w:sz w:val="28"/>
-        </w:rPr>
-        <w:t xml:space="preserve"> </w:t>
-      </w:r>
-      <w:r>
-        <w:rPr>
-          <w:sz w:val="28"/>
-        </w:rPr>
-        <w:t>количеству узлов.</w:t>
-      </w:r>
-    </w:p>
-    <w:p>
-      <w:pPr>
-        <w:spacing w:line="360" w:lineRule="auto"/>
-        <w:ind w:firstLine="709"/>
-        <w:jc w:val="both"/>
-        <w:rPr>
-          <w:sz w:val="28"/>
-        </w:rPr>
-      </w:pPr>
-      <w:r>
-        <w:rPr>
-          <w:sz w:val="28"/>
-        </w:rPr>
-        <w:t>Пространственная сложность относится к максимальному количеству узлов,</w:t>
-      </w:r>
-      <w:r>
-        <w:rPr>
-          <w:sz w:val="28"/>
-        </w:rPr>
-        <w:t xml:space="preserve"> </w:t>
-      </w:r>
-      <w:r>
-        <w:rPr>
-          <w:sz w:val="28"/>
-        </w:rPr>
-        <w:t>которые нужно хранить в памяти в любой момент времени. В некоторых</w:t>
-      </w:r>
-    </w:p>
-    <w:p>
-      <w:pPr>
-        <w:spacing w:line="360" w:lineRule="auto"/>
-        <w:ind w:firstLine="709"/>
-        <w:jc w:val="both"/>
-        <w:rPr>
-          <w:sz w:val="28"/>
-        </w:rPr>
-      </w:pPr>
-      <w:r>
-        <w:rPr>
-          <w:sz w:val="28"/>
-        </w:rPr>
-        <w:t>алгоритмах она совпадает с временной сложностью.</w:t>
-      </w:r>
-    </w:p>
-    <w:p>
-      <w:pPr>
-        <w:spacing w:line="360" w:lineRule="auto"/>
-        <w:ind w:firstLine="709"/>
-        <w:jc w:val="both"/>
-        <w:rPr>
-          <w:sz w:val="28"/>
-        </w:rPr>
-      </w:pPr>
-      <w:r>
-        <w:rPr>
-          <w:sz w:val="28"/>
-        </w:rPr>
-        <w:t>Пространственная сложность зависит от того, какие узлы сохраняются в</w:t>
-      </w:r>
-      <w:r>
-        <w:rPr>
-          <w:sz w:val="28"/>
-        </w:rPr>
-        <w:t xml:space="preserve"> </w:t>
-      </w:r>
-      <w:r>
-        <w:rPr>
-          <w:sz w:val="28"/>
-        </w:rPr>
-        <w:t>памяти. В некоторых алгоритмах необходимо сохранять все сгенерированные</w:t>
-      </w:r>
-      <w:r>
-        <w:rPr>
-          <w:sz w:val="28"/>
-        </w:rPr>
-        <w:t xml:space="preserve"> </w:t>
-      </w:r>
-      <w:r>
-        <w:rPr>
-          <w:sz w:val="28"/>
-        </w:rPr>
-        <w:t>узлы, тогда как в других узлы могут быть отброшены после проверки, не</w:t>
-      </w:r>
-      <w:r>
-        <w:rPr>
-          <w:sz w:val="28"/>
-        </w:rPr>
-        <w:t xml:space="preserve"> </w:t>
-      </w:r>
-      <w:r>
-        <w:rPr>
-          <w:sz w:val="28"/>
-        </w:rPr>
-        <w:t>требуя длительного сохранения в памяти. Это различие позволяет временной</w:t>
-      </w:r>
-      <w:r>
-        <w:rPr>
-          <w:sz w:val="28"/>
-        </w:rPr>
-        <w:t xml:space="preserve"> </w:t>
-      </w:r>
-      <w:r>
-        <w:rPr>
-          <w:sz w:val="28"/>
-        </w:rPr>
-        <w:t>и пространственной сложности отличаться друг от друга.</w:t>
-      </w:r>
-    </w:p>
-    <w:p>
-      <w:pPr>
-        <w:spacing w:line="360" w:lineRule="auto"/>
-        <w:ind w:firstLine="709"/>
-        <w:jc w:val="both"/>
-        <w:rPr>
-          <w:sz w:val="28"/>
-        </w:rPr>
-      </w:pPr>
-      <w:r>
-        <w:rPr>
-          <w:sz w:val="28"/>
-        </w:rPr>
-        <w:t>Оптимальность - это способность алгоритма всегда находить наилучшее</w:t>
-      </w:r>
-    </w:p>
-    <w:p>
-      <w:pPr>
-        <w:spacing w:line="360" w:lineRule="auto"/>
-        <w:ind w:firstLine="709"/>
-        <w:jc w:val="both"/>
-        <w:rPr>
-          <w:sz w:val="28"/>
-        </w:rPr>
-      </w:pPr>
-      <w:r>
-        <w:rPr>
-          <w:sz w:val="28"/>
-        </w:rPr>
-        <w:t>решение с минимальной стоимостью, если таковое существует. Она не</w:t>
-      </w:r>
-    </w:p>
-    <w:p>
-      <w:pPr>
-        <w:spacing w:line="360" w:lineRule="auto"/>
-        <w:ind w:firstLine="709"/>
-        <w:jc w:val="both"/>
-        <w:rPr>
-          <w:sz w:val="28"/>
-        </w:rPr>
-      </w:pPr>
-      <w:r>
-        <w:rPr>
-          <w:sz w:val="28"/>
-        </w:rPr>
-        <w:t>связана напрямую с временной или пространственной сложностью, которые</w:t>
-      </w:r>
-      <w:r>
-        <w:rPr>
-          <w:sz w:val="28"/>
-        </w:rPr>
-        <w:t xml:space="preserve"> </w:t>
-      </w:r>
-      <w:r>
-        <w:rPr>
-          <w:sz w:val="28"/>
-        </w:rPr>
-        <w:t>измеряют количество узлов. Оптимальность не гарантирует быстродействие</w:t>
-      </w:r>
-      <w:r>
-        <w:rPr>
-          <w:sz w:val="28"/>
-        </w:rPr>
-        <w:t xml:space="preserve"> </w:t>
-      </w:r>
-      <w:r>
-        <w:rPr>
-          <w:sz w:val="28"/>
-        </w:rPr>
-        <w:t>или экономию памяти, а лишь обеспечивает нахождение решения с</w:t>
-      </w:r>
-      <w:r>
-        <w:rPr>
-          <w:sz w:val="28"/>
-        </w:rPr>
-        <w:t xml:space="preserve"> </w:t>
-      </w:r>
-      <w:r>
-        <w:rPr>
-          <w:sz w:val="28"/>
-        </w:rPr>
-        <w:t>наименьшей стоимостью.</w:t>
-      </w:r>
-    </w:p>
-    <w:p>
-      <w:pPr>
-        <w:spacing w:line="360" w:lineRule="auto"/>
-        <w:ind w:firstLine="709"/>
-        <w:jc w:val="both"/>
-        <w:rPr>
-          <w:sz w:val="28"/>
-        </w:rPr>
-      </w:pPr>
-      <w:r>
-        <w:rPr>
-          <w:sz w:val="28"/>
-        </w:rPr>
-        <w:t>1. b (максимальный коэффициент разветвления) - показывает, сколько</w:t>
-      </w:r>
-      <w:r>
-        <w:rPr>
-          <w:sz w:val="28"/>
-        </w:rPr>
-        <w:t xml:space="preserve"> </w:t>
-      </w:r>
-      <w:r>
-        <w:rPr>
-          <w:sz w:val="28"/>
-        </w:rPr>
-        <w:t>дочерних узлов может иметь один узел.</w:t>
-      </w:r>
-    </w:p>
-    <w:p>
-      <w:pPr>
-        <w:spacing w:line="360" w:lineRule="auto"/>
-        <w:ind w:firstLine="709"/>
-        <w:jc w:val="both"/>
-        <w:rPr>
-          <w:sz w:val="28"/>
-        </w:rPr>
-      </w:pPr>
-      <w:r>
-        <w:rPr>
-          <w:sz w:val="28"/>
-        </w:rPr>
-        <w:t>2. d (глубина наименее дорогого решения) - определяет, насколько далеко</w:t>
-      </w:r>
-      <w:r>
-        <w:rPr>
-          <w:sz w:val="28"/>
-        </w:rPr>
-        <w:t xml:space="preserve"> </w:t>
-      </w:r>
-      <w:r>
-        <w:rPr>
-          <w:sz w:val="28"/>
-        </w:rPr>
-        <w:t>нужно спуститься по дереву для нахождения оптимального решения.</w:t>
-      </w:r>
-    </w:p>
-    <w:p>
-      <w:pPr>
-        <w:spacing w:line="360" w:lineRule="auto"/>
-        <w:ind w:firstLine="709"/>
-        <w:jc w:val="both"/>
-        <w:rPr>
-          <w:sz w:val="28"/>
-        </w:rPr>
-      </w:pPr>
-      <w:r>
-        <w:rPr>
-          <w:sz w:val="28"/>
-        </w:rPr>
-        <w:t>3. m (максимальная глубина дерева) - показывает, насколько глубоко можно в</w:t>
-      </w:r>
-      <w:r>
-        <w:rPr>
-          <w:sz w:val="28"/>
-        </w:rPr>
-        <w:t xml:space="preserve"> </w:t>
-      </w:r>
-      <w:r>
-        <w:rPr>
-          <w:sz w:val="28"/>
-        </w:rPr>
-        <w:t>принципе спуститься по дереву. В некоторых случаях это значение может быть</w:t>
-      </w:r>
-      <w:r>
-        <w:rPr>
-          <w:sz w:val="28"/>
-        </w:rPr>
-        <w:t xml:space="preserve"> </w:t>
-      </w:r>
-      <w:r>
-        <w:rPr>
-          <w:sz w:val="28"/>
-        </w:rPr>
-        <w:t>бесконечным.</w:t>
-      </w:r>
-    </w:p>
-    <w:p>
-      <w:pPr>
-        <w:spacing w:line="360" w:lineRule="auto"/>
-        <w:ind w:firstLine="709"/>
-        <w:jc w:val="both"/>
-        <w:rPr>
-          <w:sz w:val="28"/>
-        </w:rPr>
-      </w:pPr>
-      <w:r>
-        <w:rPr>
-          <w:sz w:val="28"/>
-        </w:rPr>
-        <w:t>21. Какую роль выполняет класс Problem в приведенном коде?</w:t>
-      </w:r>
-    </w:p>
-    <w:p>
-      <w:pPr>
-        <w:spacing w:line="360" w:lineRule="auto"/>
-        <w:ind w:firstLine="709"/>
-        <w:jc w:val="both"/>
-        <w:rPr>
-          <w:sz w:val="28"/>
-        </w:rPr>
-      </w:pPr>
-      <w:r>
-        <w:rPr>
-          <w:sz w:val="28"/>
-        </w:rPr>
         <w:t>Этот класс служит шаблоном для</w:t>
       </w:r>
       <w:r>
@@ -3028,693 +3140,721 @@
         <w:rPr>
           <w:sz w:val="28"/>
         </w:rPr>
+        <w:t>22. Какие методы необходимо переопределить при наследовании класса</w:t>
+      </w:r>
+      <w:r>
+        <w:rPr>
+          <w:sz w:val="28"/>
+        </w:rPr>
+        <w:t xml:space="preserve"> </w:t>
+      </w:r>
+      <w:r>
+        <w:rPr>
+          <w:sz w:val="28"/>
+        </w:rPr>
+        <w:t>Problem?</w:t>
+      </w:r>
+    </w:p>
+    <w:p>
+      <w:pPr>
+        <w:spacing w:line="360" w:lineRule="auto"/>
+        <w:ind w:firstLine="709"/>
+        <w:jc w:val="both"/>
+        <w:rPr>
+          <w:sz w:val="28"/>
+          <w:lang w:val="en-GB"/>
+        </w:rPr>
+      </w:pPr>
+      <w:r>
+        <w:rPr>
+          <w:sz w:val="28"/>
+        </w:rPr>
+        <w:t>Методы</w:t>
+      </w:r>
+      <w:r>
+        <w:rPr>
+          <w:sz w:val="28"/>
+          <w:lang w:val="en-GB"/>
+        </w:rPr>
+        <w:t xml:space="preserve"> actions</w:t>
+      </w:r>
+      <w:r>
+        <w:rPr>
+          <w:sz w:val="28"/>
+          <w:lang w:val="en-GB"/>
+        </w:rPr>
+        <w:t>,</w:t>
+      </w:r>
+      <w:r>
+        <w:rPr>
+          <w:sz w:val="28"/>
+          <w:lang w:val="en-GB"/>
+        </w:rPr>
+        <w:t xml:space="preserve">  result, is_goal, action_cost </w:t>
+      </w:r>
+      <w:r>
+        <w:rPr>
+          <w:sz w:val="28"/>
+        </w:rPr>
+        <w:t>и</w:t>
+      </w:r>
+      <w:r>
+        <w:rPr>
+          <w:sz w:val="28"/>
+          <w:lang w:val="en-GB"/>
+        </w:rPr>
+        <w:t xml:space="preserve"> h.</w:t>
+      </w:r>
+    </w:p>
+    <w:p>
+      <w:pPr>
+        <w:spacing w:line="360" w:lineRule="auto"/>
+        <w:ind w:firstLine="709"/>
+        <w:jc w:val="both"/>
+        <w:rPr>
+          <w:sz w:val="28"/>
+        </w:rPr>
+      </w:pPr>
+      <w:r>
+        <w:rPr>
+          <w:sz w:val="28"/>
+        </w:rPr>
+        <w:t>23. Что делает метод is_goal в классе Problem ?</w:t>
+      </w:r>
+    </w:p>
+    <w:p>
+      <w:pPr>
+        <w:spacing w:line="360" w:lineRule="auto"/>
+        <w:ind w:firstLine="709"/>
+        <w:jc w:val="both"/>
+        <w:rPr>
+          <w:sz w:val="28"/>
+        </w:rPr>
+      </w:pPr>
+      <w:r>
+        <w:rPr>
+          <w:sz w:val="28"/>
+        </w:rPr>
+        <w:t>Метод is_goal проверяет, достигнуто ли целевое</w:t>
+      </w:r>
+      <w:r>
+        <w:rPr>
+          <w:sz w:val="28"/>
+        </w:rPr>
+        <w:t xml:space="preserve"> </w:t>
+      </w:r>
+      <w:r>
+        <w:rPr>
+          <w:sz w:val="28"/>
+        </w:rPr>
+        <w:t>состояние.</w:t>
+      </w:r>
+    </w:p>
+    <w:p>
+      <w:pPr>
+        <w:spacing w:line="360" w:lineRule="auto"/>
+        <w:ind w:firstLine="709"/>
+        <w:jc w:val="both"/>
+        <w:rPr>
+          <w:sz w:val="28"/>
+        </w:rPr>
+      </w:pPr>
+      <w:r>
+        <w:rPr>
+          <w:sz w:val="28"/>
+        </w:rPr>
+        <w:t>24. Для чего используется метод action_cost в классе Problem ?</w:t>
+      </w:r>
+    </w:p>
+    <w:p>
+      <w:pPr>
+        <w:spacing w:line="360" w:lineRule="auto"/>
+        <w:ind w:firstLine="709"/>
+        <w:jc w:val="both"/>
+        <w:rPr>
+          <w:sz w:val="28"/>
+        </w:rPr>
+      </w:pPr>
+      <w:r>
+        <w:rPr>
+          <w:sz w:val="28"/>
+        </w:rPr>
+        <w:t>Методы action_cost и h предоставляют стандартные реализации для</w:t>
+      </w:r>
+      <w:r>
+        <w:rPr>
+          <w:sz w:val="28"/>
+        </w:rPr>
+        <w:t xml:space="preserve"> </w:t>
+      </w:r>
+      <w:r>
+        <w:rPr>
+          <w:sz w:val="28"/>
+        </w:rPr>
+        <w:t>стоимости действия и эвристической функции соответственно.</w:t>
+      </w:r>
+    </w:p>
+    <w:p>
+      <w:pPr>
+        <w:spacing w:line="360" w:lineRule="auto"/>
+        <w:ind w:firstLine="709"/>
+        <w:jc w:val="both"/>
+        <w:rPr>
+          <w:sz w:val="28"/>
+        </w:rPr>
+      </w:pPr>
+      <w:r>
+        <w:rPr>
+          <w:sz w:val="28"/>
+        </w:rPr>
+        <w:t>25. Какую задачу выполняет класс Node в алгоритмах поиска?</w:t>
+      </w:r>
+    </w:p>
+    <w:p>
+      <w:pPr>
+        <w:spacing w:line="360" w:lineRule="auto"/>
+        <w:ind w:firstLine="709"/>
+        <w:jc w:val="both"/>
+        <w:rPr>
+          <w:sz w:val="28"/>
+        </w:rPr>
+      </w:pPr>
+      <w:r>
+        <w:rPr>
+          <w:sz w:val="28"/>
+        </w:rPr>
+        <w:t>Node представляет узел в дереве поиска.</w:t>
+      </w:r>
+    </w:p>
+    <w:p>
+      <w:pPr>
+        <w:spacing w:line="360" w:lineRule="auto"/>
+        <w:ind w:firstLine="709"/>
+        <w:jc w:val="both"/>
+        <w:rPr>
+          <w:sz w:val="28"/>
+        </w:rPr>
+      </w:pPr>
+      <w:r>
+        <w:rPr>
+          <w:sz w:val="28"/>
+        </w:rPr>
+        <w:t>26. Какие параметры принимает конструктор класса Node ?</w:t>
+      </w:r>
+    </w:p>
+    <w:p>
+      <w:pPr>
+        <w:spacing w:line="360" w:lineRule="auto"/>
+        <w:ind w:firstLine="709"/>
+        <w:jc w:val="both"/>
+        <w:rPr>
+          <w:sz w:val="28"/>
+        </w:rPr>
+      </w:pPr>
+      <w:r>
+        <w:rPr>
+          <w:sz w:val="28"/>
+        </w:rPr>
+        <w:t>Принимает текущее состояние (state), ссылку на</w:t>
+      </w:r>
+      <w:r>
+        <w:rPr>
+          <w:sz w:val="28"/>
+        </w:rPr>
+        <w:t xml:space="preserve"> </w:t>
+      </w:r>
+      <w:r>
+        <w:rPr>
+          <w:sz w:val="28"/>
+        </w:rPr>
+        <w:t>родительский узел (parent), действие, которое привело к этому узлу (action), и</w:t>
+      </w:r>
+      <w:r>
+        <w:rPr>
+          <w:sz w:val="28"/>
+        </w:rPr>
+        <w:t xml:space="preserve"> </w:t>
+      </w:r>
+      <w:r>
+        <w:rPr>
+          <w:sz w:val="28"/>
+        </w:rPr>
+        <w:t>стоимость пути (path_cost).</w:t>
+      </w:r>
+    </w:p>
+    <w:p>
+      <w:pPr>
+        <w:spacing w:line="360" w:lineRule="auto"/>
+        <w:ind w:firstLine="709"/>
+        <w:jc w:val="both"/>
+        <w:rPr>
+          <w:sz w:val="28"/>
+        </w:rPr>
+      </w:pPr>
+      <w:r>
+        <w:rPr>
+          <w:sz w:val="28"/>
+        </w:rPr>
+        <w:t>27. Что представляет собой специальный узел failure ?</w:t>
+      </w:r>
+    </w:p>
+    <w:p>
+      <w:pPr>
+        <w:spacing w:line="360" w:lineRule="auto"/>
+        <w:ind w:firstLine="709"/>
+        <w:jc w:val="both"/>
+        <w:rPr>
+          <w:sz w:val="28"/>
+        </w:rPr>
+      </w:pPr>
+      <w:r>
+        <w:rPr>
+          <w:sz w:val="28"/>
+        </w:rPr>
+        <w:t>О</w:t>
+      </w:r>
+      <w:r>
+        <w:rPr>
+          <w:sz w:val="28"/>
+        </w:rPr>
+        <w:t>бозначени</w:t>
+      </w:r>
+      <w:r>
+        <w:rPr>
+          <w:sz w:val="28"/>
+        </w:rPr>
+        <w:t>е</w:t>
+      </w:r>
+      <w:r>
+        <w:rPr>
+          <w:sz w:val="28"/>
+        </w:rPr>
+        <w:t xml:space="preserve"> неудачи в поиске</w:t>
+      </w:r>
+      <w:r>
+        <w:rPr>
+          <w:sz w:val="28"/>
+        </w:rPr>
+        <w:t>.</w:t>
+      </w:r>
+    </w:p>
+    <w:p>
+      <w:pPr>
+        <w:spacing w:line="360" w:lineRule="auto"/>
+        <w:ind w:firstLine="709"/>
+        <w:jc w:val="both"/>
+        <w:rPr>
+          <w:sz w:val="28"/>
+        </w:rPr>
+      </w:pPr>
+      <w:r>
+        <w:rPr>
+          <w:sz w:val="28"/>
+        </w:rPr>
+        <w:t>28. Для чего используется функция expand в коде?</w:t>
+      </w:r>
+    </w:p>
+    <w:p>
+      <w:pPr>
+        <w:spacing w:line="360" w:lineRule="auto"/>
+        <w:ind w:firstLine="709"/>
+        <w:jc w:val="both"/>
+        <w:rPr>
+          <w:sz w:val="28"/>
+        </w:rPr>
+      </w:pPr>
+      <w:r>
+        <w:rPr>
+          <w:sz w:val="28"/>
+        </w:rPr>
+        <w:t>Р</w:t>
+      </w:r>
+      <w:r>
+        <w:rPr>
+          <w:sz w:val="28"/>
+        </w:rPr>
+        <w:t>асширяет узел, генерируя дочерние узлы.</w:t>
+      </w:r>
+    </w:p>
+    <w:p>
+      <w:pPr>
+        <w:spacing w:line="360" w:lineRule="auto"/>
+        <w:ind w:firstLine="709"/>
+        <w:jc w:val="both"/>
+        <w:rPr>
+          <w:sz w:val="28"/>
+        </w:rPr>
+      </w:pPr>
+      <w:r>
+        <w:rPr>
+          <w:sz w:val="28"/>
+        </w:rPr>
+        <w:t>29. Какая последовательность действий генерируется с помощью функции</w:t>
+      </w:r>
+      <w:r>
+        <w:rPr>
+          <w:sz w:val="28"/>
+        </w:rPr>
+        <w:t xml:space="preserve"> </w:t>
+      </w:r>
+      <w:r>
+        <w:rPr>
+          <w:sz w:val="28"/>
+          <w:lang w:val="en-GB"/>
+        </w:rPr>
+        <w:t>path</w:t>
+      </w:r>
+      <w:r>
+        <w:rPr>
+          <w:sz w:val="28"/>
+        </w:rPr>
+        <w:t>_</w:t>
+      </w:r>
+      <w:r>
+        <w:rPr>
+          <w:sz w:val="28"/>
+          <w:lang w:val="en-GB"/>
+        </w:rPr>
+        <w:t>actions</w:t>
+      </w:r>
+      <w:r>
+        <w:rPr>
+          <w:sz w:val="28"/>
+        </w:rPr>
+        <w:t xml:space="preserve"> ?</w:t>
+      </w:r>
+    </w:p>
+    <w:p>
+      <w:pPr>
+        <w:spacing w:line="360" w:lineRule="auto"/>
+        <w:ind w:firstLine="709"/>
+        <w:jc w:val="both"/>
+        <w:rPr>
+          <w:sz w:val="28"/>
+          <w:lang w:val="en-150"/>
+        </w:rPr>
+      </w:pPr>
+      <w:r>
+        <w:rPr>
+          <w:sz w:val="28"/>
+        </w:rPr>
+        <w:t xml:space="preserve">Та, с помощью которой можно добраться до узла </w:t>
+      </w:r>
+      <w:r>
+        <w:rPr>
+          <w:sz w:val="28"/>
+          <w:lang w:val="en-150"/>
+        </w:rPr>
+        <w:t>node.</w:t>
+      </w:r>
+    </w:p>
+    <w:p>
+      <w:pPr>
+        <w:spacing w:line="360" w:lineRule="auto"/>
+        <w:ind w:firstLine="709"/>
+        <w:jc w:val="both"/>
+        <w:rPr>
+          <w:sz w:val="28"/>
+        </w:rPr>
+      </w:pPr>
+      <w:r>
+        <w:rPr>
+          <w:sz w:val="28"/>
+        </w:rPr>
+        <w:t xml:space="preserve">30. </w:t>
+      </w:r>
+      <w:r>
+        <w:rPr>
+          <w:sz w:val="28"/>
+        </w:rPr>
+        <w:t>Чем</w:t>
+      </w:r>
+      <w:r>
+        <w:rPr>
+          <w:sz w:val="28"/>
+        </w:rPr>
+        <w:t xml:space="preserve"> </w:t>
+      </w:r>
+      <w:r>
+        <w:rPr>
+          <w:sz w:val="28"/>
+        </w:rPr>
+        <w:t>отличается</w:t>
+      </w:r>
+      <w:r>
+        <w:rPr>
+          <w:sz w:val="28"/>
+        </w:rPr>
+        <w:t xml:space="preserve"> </w:t>
+      </w:r>
+      <w:r>
+        <w:rPr>
+          <w:sz w:val="28"/>
+        </w:rPr>
+        <w:t>функция</w:t>
+      </w:r>
+      <w:r>
+        <w:rPr>
+          <w:sz w:val="28"/>
+        </w:rPr>
+        <w:t xml:space="preserve"> </w:t>
+      </w:r>
+      <w:r>
+        <w:rPr>
+          <w:sz w:val="28"/>
+          <w:lang w:val="en-GB"/>
+        </w:rPr>
+        <w:t>path</w:t>
+      </w:r>
+      <w:r>
+        <w:rPr>
+          <w:sz w:val="28"/>
+        </w:rPr>
+        <w:t>_</w:t>
+      </w:r>
+      <w:r>
+        <w:rPr>
+          <w:sz w:val="28"/>
+          <w:lang w:val="en-GB"/>
+        </w:rPr>
+        <w:t>states</w:t>
+      </w:r>
+      <w:r>
+        <w:rPr>
+          <w:sz w:val="28"/>
+        </w:rPr>
+        <w:t xml:space="preserve"> </w:t>
+      </w:r>
+      <w:r>
+        <w:rPr>
+          <w:sz w:val="28"/>
+        </w:rPr>
+        <w:t>от</w:t>
+      </w:r>
+      <w:r>
+        <w:rPr>
+          <w:sz w:val="28"/>
+        </w:rPr>
+        <w:t xml:space="preserve"> </w:t>
+      </w:r>
+      <w:r>
+        <w:rPr>
+          <w:sz w:val="28"/>
+        </w:rPr>
+        <w:t>функции</w:t>
+      </w:r>
+      <w:r>
+        <w:rPr>
+          <w:sz w:val="28"/>
+        </w:rPr>
+        <w:t xml:space="preserve"> </w:t>
+      </w:r>
+      <w:r>
+        <w:rPr>
+          <w:sz w:val="28"/>
+          <w:lang w:val="en-GB"/>
+        </w:rPr>
+        <w:t>path</w:t>
+      </w:r>
+      <w:r>
+        <w:rPr>
+          <w:sz w:val="28"/>
+        </w:rPr>
+        <w:t>_</w:t>
+      </w:r>
+      <w:r>
+        <w:rPr>
+          <w:sz w:val="28"/>
+          <w:lang w:val="en-GB"/>
+        </w:rPr>
+        <w:t>actions</w:t>
+      </w:r>
+      <w:r>
+        <w:rPr>
+          <w:sz w:val="28"/>
+        </w:rPr>
+        <w:t xml:space="preserve"> ?</w:t>
+      </w:r>
+    </w:p>
+    <w:p>
+      <w:pPr>
+        <w:spacing w:line="360" w:lineRule="auto"/>
+        <w:ind w:firstLine="709"/>
+        <w:jc w:val="both"/>
+        <w:rPr>
+          <w:sz w:val="28"/>
+        </w:rPr>
+      </w:pPr>
+      <w:r>
+        <w:rPr>
+          <w:sz w:val="28"/>
+        </w:rPr>
+        <w:t>path_actions</w:t>
+      </w:r>
+      <w:r>
+        <w:rPr>
+          <w:sz w:val="28"/>
+        </w:rPr>
+        <w:t xml:space="preserve"> дает п</w:t>
+      </w:r>
+      <w:r>
+        <w:rPr>
+          <w:sz w:val="28"/>
+        </w:rPr>
+        <w:t>оследовательность действий, чтобы добраться до узла</w:t>
+      </w:r>
+      <w:r>
+        <w:rPr>
+          <w:sz w:val="28"/>
+        </w:rPr>
+        <w:t xml:space="preserve"> </w:t>
+      </w:r>
+      <w:r>
+        <w:rPr>
+          <w:sz w:val="28"/>
+          <w:lang w:val="en-150"/>
+        </w:rPr>
+        <w:t xml:space="preserve">node, a </w:t>
+      </w:r>
+      <w:r>
+        <w:rPr>
+          <w:sz w:val="28"/>
+          <w:lang w:val="en-150"/>
+        </w:rPr>
+        <w:t>path_states</w:t>
+      </w:r>
+      <w:r>
+        <w:rPr>
+          <w:sz w:val="28"/>
+          <w:lang w:val="en-150"/>
+        </w:rPr>
+        <w:t xml:space="preserve"> -</w:t>
+      </w:r>
+      <w:r>
+        <w:rPr>
+          <w:sz w:val="28"/>
+        </w:rPr>
+        <w:t xml:space="preserve"> последовательность состояний.</w:t>
+      </w:r>
+    </w:p>
+    <w:p>
+      <w:pPr>
+        <w:spacing w:line="360" w:lineRule="auto"/>
+        <w:ind w:firstLine="709"/>
+        <w:jc w:val="both"/>
+        <w:rPr>
+          <w:sz w:val="28"/>
+        </w:rPr>
+      </w:pPr>
+      <w:r>
+        <w:rPr>
+          <w:sz w:val="28"/>
+        </w:rPr>
+        <w:t>31. Какой тип данных используется для реализации FIFOQueue ?</w:t>
+      </w:r>
+    </w:p>
+    <w:p>
+      <w:pPr>
+        <w:spacing w:line="360" w:lineRule="auto"/>
+        <w:ind w:firstLine="709"/>
+        <w:jc w:val="both"/>
+        <w:rPr>
+          <w:sz w:val="28"/>
+        </w:rPr>
+      </w:pPr>
+      <w:r>
+        <w:rPr>
+          <w:sz w:val="28"/>
+        </w:rPr>
         <w:lastRenderedPageBreak/>
-        <w:t>22. Какие методы необходимо переопределить при наследовании класса</w:t>
-      </w:r>
-      <w:r>
-        <w:rPr>
-          <w:sz w:val="28"/>
-        </w:rPr>
-        <w:t xml:space="preserve"> </w:t>
-      </w:r>
-      <w:r>
-        <w:rPr>
-          <w:sz w:val="28"/>
-        </w:rPr>
-        <w:t>Problem?</w:t>
-      </w:r>
-    </w:p>
-    <w:p>
-      <w:pPr>
-        <w:spacing w:line="360" w:lineRule="auto"/>
-        <w:ind w:firstLine="709"/>
-        <w:jc w:val="both"/>
-        <w:rPr>
-          <w:sz w:val="28"/>
-          <w:lang w:val="en-GB"/>
-        </w:rPr>
-      </w:pPr>
-      <w:r>
-        <w:rPr>
-          <w:sz w:val="28"/>
-        </w:rPr>
-        <w:t>Методы</w:t>
-      </w:r>
-      <w:r>
-        <w:rPr>
-          <w:sz w:val="28"/>
-          <w:lang w:val="en-GB"/>
-        </w:rPr>
-        <w:t xml:space="preserve"> actions</w:t>
-      </w:r>
-      <w:r>
-        <w:rPr>
-          <w:sz w:val="28"/>
-          <w:lang w:val="en-GB"/>
-        </w:rPr>
-        <w:t>,</w:t>
-      </w:r>
-      <w:r>
-        <w:rPr>
-          <w:sz w:val="28"/>
-          <w:lang w:val="en-GB"/>
-        </w:rPr>
-        <w:t xml:space="preserve">  result, is_goal, action_cost </w:t>
-      </w:r>
-      <w:r>
-        <w:rPr>
-          <w:sz w:val="28"/>
-        </w:rPr>
-        <w:t>и</w:t>
-      </w:r>
-      <w:r>
-        <w:rPr>
-          <w:sz w:val="28"/>
-          <w:lang w:val="en-GB"/>
-        </w:rPr>
-        <w:t xml:space="preserve"> h.</w:t>
-      </w:r>
-    </w:p>
-    <w:p>
-      <w:pPr>
-        <w:spacing w:line="360" w:lineRule="auto"/>
-        <w:ind w:firstLine="709"/>
-        <w:jc w:val="both"/>
-        <w:rPr>
-          <w:sz w:val="28"/>
-        </w:rPr>
-      </w:pPr>
-      <w:r>
-        <w:rPr>
-          <w:sz w:val="28"/>
-        </w:rPr>
-        <w:t>23. Что делает метод is_goal в классе Problem ?</w:t>
-      </w:r>
-    </w:p>
-    <w:p>
-      <w:pPr>
-        <w:spacing w:line="360" w:lineRule="auto"/>
-        <w:ind w:firstLine="709"/>
-        <w:jc w:val="both"/>
-        <w:rPr>
-          <w:sz w:val="28"/>
-        </w:rPr>
-      </w:pPr>
-      <w:r>
-        <w:rPr>
-          <w:sz w:val="28"/>
-        </w:rPr>
-        <w:t>Метод is_goal проверяет, достигнуто ли целевое</w:t>
-      </w:r>
-      <w:r>
-        <w:rPr>
-          <w:sz w:val="28"/>
-        </w:rPr>
-        <w:t xml:space="preserve"> </w:t>
-      </w:r>
-      <w:r>
-        <w:rPr>
-          <w:sz w:val="28"/>
-        </w:rPr>
-        <w:t>состояние.</w:t>
-      </w:r>
-    </w:p>
-    <w:p>
-      <w:pPr>
-        <w:spacing w:line="360" w:lineRule="auto"/>
-        <w:ind w:firstLine="709"/>
-        <w:jc w:val="both"/>
-        <w:rPr>
-          <w:sz w:val="28"/>
-        </w:rPr>
-      </w:pPr>
-      <w:r>
-        <w:rPr>
-          <w:sz w:val="28"/>
-        </w:rPr>
-        <w:t>24. Для чего используется метод action_cost в классе Problem ?</w:t>
-      </w:r>
-    </w:p>
-    <w:p>
-      <w:pPr>
-        <w:spacing w:line="360" w:lineRule="auto"/>
-        <w:ind w:firstLine="709"/>
-        <w:jc w:val="both"/>
-        <w:rPr>
-          <w:sz w:val="28"/>
-        </w:rPr>
-      </w:pPr>
-      <w:r>
-        <w:rPr>
-          <w:sz w:val="28"/>
-        </w:rPr>
-        <w:t>Методы action_cost и h предоставляют стандартные реализации для</w:t>
-      </w:r>
-      <w:r>
-        <w:rPr>
-          <w:sz w:val="28"/>
-        </w:rPr>
-        <w:t xml:space="preserve"> </w:t>
-      </w:r>
-      <w:r>
-        <w:rPr>
-          <w:sz w:val="28"/>
-        </w:rPr>
-        <w:t>стоимости действия и эвристической функции соответственно.</w:t>
-      </w:r>
-    </w:p>
-    <w:p>
-      <w:pPr>
-        <w:spacing w:line="360" w:lineRule="auto"/>
-        <w:ind w:firstLine="709"/>
-        <w:jc w:val="both"/>
-        <w:rPr>
-          <w:sz w:val="28"/>
-        </w:rPr>
-      </w:pPr>
-      <w:r>
-        <w:rPr>
-          <w:sz w:val="28"/>
-        </w:rPr>
-        <w:t>25. Какую задачу выполняет класс Node в алгоритмах поиска?</w:t>
-      </w:r>
-    </w:p>
-    <w:p>
-      <w:pPr>
-        <w:spacing w:line="360" w:lineRule="auto"/>
-        <w:ind w:firstLine="709"/>
-        <w:jc w:val="both"/>
-        <w:rPr>
-          <w:sz w:val="28"/>
-        </w:rPr>
-      </w:pPr>
-      <w:r>
-        <w:rPr>
-          <w:sz w:val="28"/>
-        </w:rPr>
-        <w:t>Node представляет узел в дереве поиска.</w:t>
-      </w:r>
-    </w:p>
-    <w:p>
-      <w:pPr>
-        <w:spacing w:line="360" w:lineRule="auto"/>
-        <w:ind w:firstLine="709"/>
-        <w:jc w:val="both"/>
-        <w:rPr>
-          <w:sz w:val="28"/>
-        </w:rPr>
-      </w:pPr>
-      <w:r>
-        <w:rPr>
-          <w:sz w:val="28"/>
-        </w:rPr>
-        <w:t>26. Какие параметры принимает конструктор класса Node ?</w:t>
-      </w:r>
-    </w:p>
-    <w:p>
-      <w:pPr>
-        <w:spacing w:line="360" w:lineRule="auto"/>
-        <w:ind w:firstLine="709"/>
-        <w:jc w:val="both"/>
-        <w:rPr>
-          <w:sz w:val="28"/>
-        </w:rPr>
-      </w:pPr>
-      <w:r>
-        <w:rPr>
-          <w:sz w:val="28"/>
-        </w:rPr>
-        <w:t>Принимает текущее состояние (state), ссылку на</w:t>
-      </w:r>
-      <w:r>
-        <w:rPr>
-          <w:sz w:val="28"/>
-        </w:rPr>
-        <w:t xml:space="preserve"> </w:t>
-      </w:r>
-      <w:r>
-        <w:rPr>
-          <w:sz w:val="28"/>
-        </w:rPr>
-        <w:t>родительский узел (parent), действие, которое привело к этому узлу (action), и</w:t>
-      </w:r>
-      <w:r>
-        <w:rPr>
-          <w:sz w:val="28"/>
-        </w:rPr>
-        <w:t xml:space="preserve"> </w:t>
-      </w:r>
-      <w:r>
-        <w:rPr>
-          <w:sz w:val="28"/>
-        </w:rPr>
-        <w:t>стоимость пути (path_cost).</w:t>
-      </w:r>
-    </w:p>
-    <w:p>
-      <w:pPr>
-        <w:spacing w:line="360" w:lineRule="auto"/>
-        <w:ind w:firstLine="709"/>
-        <w:jc w:val="both"/>
-        <w:rPr>
-          <w:sz w:val="28"/>
-        </w:rPr>
-      </w:pPr>
-      <w:r>
-        <w:rPr>
-          <w:sz w:val="28"/>
-        </w:rPr>
-        <w:t>27. Что представляет собой специальный узел failure ?</w:t>
-      </w:r>
-    </w:p>
-    <w:p>
-      <w:pPr>
-        <w:spacing w:line="360" w:lineRule="auto"/>
-        <w:ind w:firstLine="709"/>
-        <w:jc w:val="both"/>
-        <w:rPr>
-          <w:sz w:val="28"/>
-        </w:rPr>
-      </w:pPr>
-      <w:r>
-        <w:rPr>
-          <w:sz w:val="28"/>
-        </w:rPr>
-        <w:t>О</w:t>
-      </w:r>
-      <w:r>
-        <w:rPr>
-          <w:sz w:val="28"/>
-        </w:rPr>
-        <w:t>бозначени</w:t>
-      </w:r>
-      <w:r>
-        <w:rPr>
-          <w:sz w:val="28"/>
-        </w:rPr>
-        <w:t>е</w:t>
-      </w:r>
-      <w:r>
-        <w:rPr>
-          <w:sz w:val="28"/>
-        </w:rPr>
-        <w:t xml:space="preserve"> неудачи в поиске</w:t>
-      </w:r>
-      <w:r>
-        <w:rPr>
-          <w:sz w:val="28"/>
-        </w:rPr>
-        <w:t>.</w:t>
-      </w:r>
-    </w:p>
-    <w:p>
-      <w:pPr>
-        <w:spacing w:line="360" w:lineRule="auto"/>
-        <w:ind w:firstLine="709"/>
-        <w:jc w:val="both"/>
-        <w:rPr>
-          <w:sz w:val="28"/>
-        </w:rPr>
-      </w:pPr>
-      <w:r>
-        <w:rPr>
-          <w:sz w:val="28"/>
-        </w:rPr>
-        <w:t>28. Для чего используется функция expand в коде?</w:t>
-      </w:r>
-    </w:p>
-    <w:p>
-      <w:pPr>
-        <w:spacing w:line="360" w:lineRule="auto"/>
-        <w:ind w:firstLine="709"/>
-        <w:jc w:val="both"/>
-        <w:rPr>
-          <w:sz w:val="28"/>
-        </w:rPr>
-      </w:pPr>
-      <w:r>
-        <w:rPr>
-          <w:sz w:val="28"/>
-        </w:rPr>
-        <w:t>Р</w:t>
-      </w:r>
-      <w:r>
-        <w:rPr>
-          <w:sz w:val="28"/>
-        </w:rPr>
-        <w:t>асширяет узел, генерируя дочерние узлы.</w:t>
-      </w:r>
-    </w:p>
-    <w:p>
-      <w:pPr>
-        <w:spacing w:line="360" w:lineRule="auto"/>
-        <w:ind w:firstLine="709"/>
-        <w:jc w:val="both"/>
-        <w:rPr>
-          <w:sz w:val="28"/>
-        </w:rPr>
-      </w:pPr>
-      <w:r>
-        <w:rPr>
-          <w:sz w:val="28"/>
-        </w:rPr>
-        <w:t>29. Какая последовательность действий генерируется с помощью функции</w:t>
-      </w:r>
-      <w:r>
-        <w:rPr>
-          <w:sz w:val="28"/>
-        </w:rPr>
-        <w:t xml:space="preserve"> </w:t>
-      </w:r>
-      <w:r>
-        <w:rPr>
-          <w:sz w:val="28"/>
-          <w:lang w:val="en-GB"/>
-        </w:rPr>
-        <w:t>path</w:t>
-      </w:r>
-      <w:r>
-        <w:rPr>
-          <w:sz w:val="28"/>
-        </w:rPr>
-        <w:t>_</w:t>
-      </w:r>
-      <w:r>
-        <w:rPr>
-          <w:sz w:val="28"/>
-          <w:lang w:val="en-GB"/>
-        </w:rPr>
-        <w:t>actions</w:t>
-      </w:r>
-      <w:r>
-        <w:rPr>
-          <w:sz w:val="28"/>
-        </w:rPr>
-        <w:t xml:space="preserve"> ?</w:t>
-      </w:r>
-    </w:p>
-    <w:p>
-      <w:pPr>
-        <w:spacing w:line="360" w:lineRule="auto"/>
-        <w:ind w:firstLine="709"/>
-        <w:jc w:val="both"/>
+        <w:t xml:space="preserve">Она реализуется с помощью </w:t>
+      </w:r>
+      <w:r>
         <w:rPr>
           <w:sz w:val="28"/>
           <w:lang w:val="en-150"/>
         </w:rPr>
-      </w:pPr>
-      <w:r>
-        <w:rPr>
-          <w:sz w:val="28"/>
-        </w:rPr>
-        <w:t xml:space="preserve">Та, с помощью которой можно добраться до узла </w:t>
-      </w:r>
+        <w:t xml:space="preserve">deque из модуля collections . deque </w:t>
+      </w:r>
+      <w:proofErr w:type="gramStart"/>
       <w:r>
         <w:rPr>
           <w:sz w:val="28"/>
           <w:lang w:val="en-150"/>
         </w:rPr>
-        <w:t>node.</w:t>
-      </w:r>
-    </w:p>
-    <w:p>
-      <w:pPr>
-        <w:spacing w:line="360" w:lineRule="auto"/>
-        <w:ind w:firstLine="709"/>
-        <w:jc w:val="both"/>
-        <w:rPr>
-          <w:sz w:val="28"/>
-        </w:rPr>
-      </w:pPr>
-      <w:r>
-        <w:rPr>
-          <w:sz w:val="28"/>
-        </w:rPr>
-        <w:t xml:space="preserve">30. </w:t>
-      </w:r>
-      <w:r>
-        <w:rPr>
-          <w:sz w:val="28"/>
-        </w:rPr>
-        <w:t>Чем</w:t>
-      </w:r>
-      <w:r>
-        <w:rPr>
-          <w:sz w:val="28"/>
-        </w:rPr>
-        <w:t xml:space="preserve"> </w:t>
-      </w:r>
-      <w:r>
-        <w:rPr>
-          <w:sz w:val="28"/>
-        </w:rPr>
-        <w:t>отличается</w:t>
-      </w:r>
-      <w:r>
-        <w:rPr>
-          <w:sz w:val="28"/>
-        </w:rPr>
-        <w:t xml:space="preserve"> </w:t>
-      </w:r>
-      <w:r>
-        <w:rPr>
-          <w:sz w:val="28"/>
-        </w:rPr>
-        <w:t>функция</w:t>
-      </w:r>
-      <w:r>
-        <w:rPr>
-          <w:sz w:val="28"/>
-        </w:rPr>
-        <w:t xml:space="preserve"> </w:t>
-      </w:r>
-      <w:r>
-        <w:rPr>
-          <w:sz w:val="28"/>
-          <w:lang w:val="en-GB"/>
-        </w:rPr>
-        <w:t>path</w:t>
-      </w:r>
-      <w:r>
-        <w:rPr>
-          <w:sz w:val="28"/>
-        </w:rPr>
-        <w:t>_</w:t>
-      </w:r>
-      <w:r>
-        <w:rPr>
-          <w:sz w:val="28"/>
-          <w:lang w:val="en-GB"/>
-        </w:rPr>
-        <w:t>states</w:t>
-      </w:r>
-      <w:r>
-        <w:rPr>
-          <w:sz w:val="28"/>
-        </w:rPr>
-        <w:t xml:space="preserve"> </w:t>
-      </w:r>
-      <w:r>
-        <w:rPr>
-          <w:sz w:val="28"/>
-        </w:rPr>
-        <w:t>от</w:t>
-      </w:r>
-      <w:r>
-        <w:rPr>
-          <w:sz w:val="28"/>
-        </w:rPr>
-        <w:t xml:space="preserve"> </w:t>
-      </w:r>
-      <w:r>
-        <w:rPr>
-          <w:sz w:val="28"/>
-        </w:rPr>
-        <w:t>функции</w:t>
-      </w:r>
-      <w:r>
-        <w:rPr>
-          <w:sz w:val="28"/>
-        </w:rPr>
-        <w:t xml:space="preserve"> </w:t>
-      </w:r>
-      <w:r>
-        <w:rPr>
-          <w:sz w:val="28"/>
-          <w:lang w:val="en-GB"/>
-        </w:rPr>
-        <w:t>path</w:t>
-      </w:r>
-      <w:r>
-        <w:rPr>
-          <w:sz w:val="28"/>
-        </w:rPr>
-        <w:t>_</w:t>
-      </w:r>
-      <w:r>
-        <w:rPr>
-          <w:sz w:val="28"/>
-          <w:lang w:val="en-GB"/>
-        </w:rPr>
-        <w:t>actions</w:t>
-      </w:r>
-      <w:r>
-        <w:rPr>
-          <w:sz w:val="28"/>
-        </w:rPr>
-        <w:t xml:space="preserve"> ?</w:t>
-      </w:r>
-    </w:p>
-    <w:p>
-      <w:pPr>
-        <w:spacing w:line="360" w:lineRule="auto"/>
-        <w:ind w:firstLine="709"/>
-        <w:jc w:val="both"/>
-        <w:rPr>
-          <w:sz w:val="28"/>
-        </w:rPr>
-      </w:pPr>
-      <w:r>
-        <w:rPr>
-          <w:sz w:val="28"/>
-        </w:rPr>
-        <w:t>path_actions</w:t>
-      </w:r>
-      <w:r>
-        <w:rPr>
-          <w:sz w:val="28"/>
-        </w:rPr>
-        <w:t xml:space="preserve"> дает п</w:t>
-      </w:r>
-      <w:r>
-        <w:rPr>
-          <w:sz w:val="28"/>
-        </w:rPr>
-        <w:t>оследовательность действий, чтобы добраться до узла</w:t>
-      </w:r>
-      <w:r>
-        <w:rPr>
-          <w:sz w:val="28"/>
-        </w:rPr>
-        <w:t xml:space="preserve"> </w:t>
+        <w:t>-</w:t>
       </w:r>
       <w:r>
         <w:rPr>
           <w:sz w:val="28"/>
           <w:lang w:val="en-150"/>
         </w:rPr>
-        <w:t xml:space="preserve">node, a </w:t>
+        <w:t xml:space="preserve"> </w:t>
+      </w:r>
+      <w:r>
+        <w:rPr>
+          <w:sz w:val="28"/>
+        </w:rPr>
+        <w:t>это</w:t>
+      </w:r>
+      <w:proofErr w:type="gramEnd"/>
+      <w:r>
+        <w:rPr>
+          <w:sz w:val="28"/>
+        </w:rPr>
+        <w:t xml:space="preserve"> обобщенная версия стека и очереди, которая поддерживает добавление и удаление элементов с обоих концов.</w:t>
+      </w:r>
+    </w:p>
+    <w:p>
+      <w:pPr>
+        <w:spacing w:line="360" w:lineRule="auto"/>
+        <w:ind w:firstLine="709"/>
+        <w:jc w:val="both"/>
+        <w:rPr>
+          <w:sz w:val="28"/>
+        </w:rPr>
+      </w:pPr>
+      <w:r>
+        <w:rPr>
+          <w:sz w:val="28"/>
+        </w:rPr>
+        <w:t>32. Чем отличается очередь FIFOQueue от LIFOQueue ?</w:t>
+      </w:r>
+    </w:p>
+    <w:p>
+      <w:pPr>
+        <w:spacing w:line="360" w:lineRule="auto"/>
+        <w:ind w:firstLine="709"/>
+        <w:jc w:val="both"/>
+        <w:rPr>
+          <w:sz w:val="28"/>
+        </w:rPr>
+      </w:pPr>
+      <w:r>
+        <w:rPr>
+          <w:sz w:val="28"/>
+        </w:rPr>
+        <w:t xml:space="preserve">FIFOQueue </w:t>
+      </w:r>
+      <w:proofErr w:type="gramStart"/>
+      <w:r>
+        <w:rPr>
+          <w:sz w:val="28"/>
+        </w:rPr>
+        <w:t>- это</w:t>
+      </w:r>
+      <w:proofErr w:type="gramEnd"/>
+      <w:r>
+        <w:rPr>
+          <w:sz w:val="28"/>
+        </w:rPr>
+        <w:t xml:space="preserve"> очередь, где первый добавленный элемент будет первым</w:t>
       </w:r>
       <w:r>
         <w:rPr>
           <w:sz w:val="28"/>
           <w:lang w:val="en-150"/>
         </w:rPr>
-        <w:t>path_states</w:t>
-      </w:r>
-      <w:r>
-        <w:rPr>
-          <w:sz w:val="28"/>
-          <w:lang w:val="en-150"/>
-        </w:rPr>
-        <w:t xml:space="preserve"> -</w:t>
-      </w:r>
-      <w:r>
-        <w:rPr>
-          <w:sz w:val="28"/>
-        </w:rPr>
-        <w:t xml:space="preserve"> последовательность состояний.</w:t>
-      </w:r>
-    </w:p>
-    <w:p>
-      <w:pPr>
-        <w:spacing w:line="360" w:lineRule="auto"/>
-        <w:ind w:firstLine="709"/>
-        <w:jc w:val="both"/>
-        <w:rPr>
-          <w:sz w:val="28"/>
-        </w:rPr>
-      </w:pPr>
-      <w:r>
-        <w:rPr>
-          <w:sz w:val="28"/>
-        </w:rPr>
-        <w:t>31. Какой тип данных используется для реализации FIFOQueue ?</w:t>
-      </w:r>
-    </w:p>
-    <w:p>
-      <w:pPr>
-        <w:spacing w:line="360" w:lineRule="auto"/>
-        <w:ind w:firstLine="709"/>
-        <w:jc w:val="both"/>
-        <w:rPr>
-          <w:sz w:val="28"/>
-        </w:rPr>
-      </w:pPr>
-      <w:r>
-        <w:rPr>
-          <w:sz w:val="28"/>
-        </w:rPr>
-        <w:t xml:space="preserve">Она реализуется с помощью </w:t>
-      </w:r>
-      <w:r>
-        <w:rPr>
-          <w:sz w:val="28"/>
-          <w:lang w:val="en-150"/>
-        </w:rPr>
-        <w:t>deque из модуля collections . deque -</w:t>
-      </w:r>
-      <w:r>
-        <w:rPr>
-          <w:sz w:val="28"/>
-          <w:lang w:val="en-150"/>
-        </w:rPr>
-        <w:t xml:space="preserve"> </w:t>
-      </w:r>
-      <w:r>
-        <w:rPr>
-          <w:sz w:val="28"/>
-        </w:rPr>
-        <w:t>это обобщенная версия стека и очереди, которая поддерживает добавление и удаление элементов с обоих концов.</w:t>
-      </w:r>
-    </w:p>
-    <w:p>
-      <w:pPr>
-        <w:spacing w:line="360" w:lineRule="auto"/>
-        <w:ind w:firstLine="709"/>
-        <w:jc w:val="both"/>
-        <w:rPr>
-          <w:sz w:val="28"/>
-        </w:rPr>
-      </w:pPr>
-      <w:r>
-        <w:rPr>
-          <w:sz w:val="28"/>
-        </w:rPr>
-        <w:t>32. Чем отличается очередь FIFOQueue от LIFOQueue ?</w:t>
-      </w:r>
-    </w:p>
-    <w:p>
-      <w:pPr>
-        <w:spacing w:line="360" w:lineRule="auto"/>
-        <w:ind w:firstLine="709"/>
-        <w:jc w:val="both"/>
-        <w:rPr>
-          <w:sz w:val="28"/>
-        </w:rPr>
-      </w:pPr>
-      <w:r>
-        <w:rPr>
-          <w:sz w:val="28"/>
-        </w:rPr>
-        <w:lastRenderedPageBreak/>
-        <w:t>FIFOQueue - это очередь, где первый добавленный элемент будет первым</w:t>
-      </w:r>
-      <w:r>
-        <w:rPr>
-          <w:sz w:val="28"/>
-          <w:lang w:val="en-150"/>
-        </w:rPr>
         <w:t xml:space="preserve"> </w:t>
       </w:r>
       <w:r>
@@ -3737,7 +3877,21 @@
         <w:rPr>
           <w:sz w:val="28"/>
         </w:rPr>
-        <w:t>LIFOQueue - это стек, где последний добавленный элемент будет первым</w:t>
+        <w:t xml:space="preserve">LIFOQueue </w:t>
+      </w:r>
+      <w:proofErr w:type="gramStart"/>
+      <w:r>
+        <w:rPr>
+          <w:sz w:val="28"/>
+        </w:rPr>
+        <w:t>- это</w:t>
+      </w:r>
+      <w:proofErr w:type="gramEnd"/>
+      <w:r>
+        <w:rPr>
+          <w:sz w:val="28"/>
+        </w:rPr>
+        <w:t xml:space="preserve"> стек, где последний добавленный элемент будет первым</w:t>
       </w:r>
       <w:r>
         <w:rPr>

</xml_diff>